<commit_message>
Added comment to css file
</commit_message>
<xml_diff>
--- a/submission-less.docx
+++ b/submission-less.docx
@@ -36,6 +36,9 @@
     <w:p/>
     <w:p>
       <w:r>
+        <w:rPr>
+          <w:noProof/>
+        </w:rPr>
         <w:drawing>
           <wp:inline distT="0" distB="0" distL="0" distR="0" wp14:anchorId="7199E3C5" wp14:editId="5A48646C">
             <wp:extent cx="5943600" cy="3147695"/>
@@ -717,6 +720,7 @@
   <w:style w:type="character" w:default="1" w:styleId="DefaultParagraphFont">
     <w:name w:val="Default Paragraph Font"/>
     <w:uiPriority w:val="1"/>
+    <w:semiHidden/>
     <w:unhideWhenUsed/>
   </w:style>
   <w:style w:type="table" w:default="1" w:styleId="TableNormal">

</xml_diff>